<commit_message>
Remove suggested reviewers line from cover letter
Co-Authored-By: Claude Sonnet 5.5 <noreply@anthropic.com>
Claude-Session: https://claude.ai/code/session_01SSddyk4xchbKHwDTwjoLhd
</commit_message>
<xml_diff>
--- a/Poisson-SNS_IEEE_Access_cover_letter.docx
+++ b/Poisson-SNS_IEEE_Access_cover_letter.docx
@@ -182,17 +182,6 @@
           <w:b w:val="0"/>
         </w:rPr>
         <w:t>This manuscript is original, has not been published previously, and is not under consideration for publication elsewhere. All authors have approved the submission. In line with IEEE policy, the use of generative AI is disclosed in the Acknowledgment section. LLM raters were part of the method (Study 3), and an AI assistant was used for code implementation, analysis, and manuscript drafting. The authors reviewed and edited all content and take full responsibility for the work.</w:t>
-      </w:r>
-    </w:p>
-    <w:p>
-      <w:pPr>
-        <w:spacing w:after="160"/>
-      </w:pPr>
-      <w:r>
-        <w:rPr>
-          <w:b w:val="0"/>
-        </w:rPr>
-        <w:t>Suggested reviewers (optional): [name, affiliation, email]; [name, affiliation, email].</w:t>
       </w:r>
     </w:p>
     <w:p>

</xml_diff>